<commit_message>
feat: add stealth whatsapp scripts, outreach helper, and social proof mailer
</commit_message>
<xml_diff>
--- a/Sena_Academy_Curriculum.docx
+++ b/Sena_Academy_Curriculum.docx
@@ -2,2120 +2,7 @@
 <file path=word/document.xml><?xml version="1.0" encoding="utf-8"?>
 <w:document xmlns:wpc="http://schemas.microsoft.com/office/word/2010/wordprocessingCanvas" xmlns:cx="http://schemas.microsoft.com/office/drawing/2014/chartex" xmlns:cx1="http://schemas.microsoft.com/office/drawing/2015/9/8/chartex" xmlns:cx2="http://schemas.microsoft.com/office/drawing/2015/10/21/chartex" xmlns:cx3="http://schemas.microsoft.com/office/drawing/2016/5/9/chartex" xmlns:cx4="http://schemas.microsoft.com/office/drawing/2016/5/10/chartex" xmlns:cx5="http://schemas.microsoft.com/office/drawing/2016/5/11/chartex" xmlns:cx6="http://schemas.microsoft.com/office/drawing/2016/5/12/chartex" xmlns:cx7="http://schemas.microsoft.com/office/drawing/2016/5/13/chartex" xmlns:cx8="http://schemas.microsoft.com/office/drawing/2016/5/14/chartex" xmlns:mc="http://schemas.openxmlformats.org/markup-compatibility/2006" xmlns:aink="http://schemas.microsoft.com/office/drawing/2016/ink" xmlns:am3d="http://schemas.microsoft.com/office/drawing/2017/model3d" xmlns:o="urn:schemas-microsoft-com:office:office" xmlns:oel="http://schemas.microsoft.com/office/2019/extlst" xmlns:r="http://schemas.openxmlformats.org/officeDocument/2006/relationships" xmlns:m="http://schemas.openxmlformats.org/officeDocument/2006/math" xmlns:v="urn:schemas-microsoft-com:vml" xmlns:wp14="http://schemas.microsoft.com/office/word/2010/wordprocessingDrawing" xmlns:wp="http://schemas.openxmlformats.org/drawingml/2006/wordprocessingDrawing" xmlns:w10="urn:schemas-microsoft-com:office:word" xmlns:w="http://schemas.openxmlformats.org/wordprocessingml/2006/main" xmlns:w14="http://schemas.microsoft.com/office/word/2010/wordml" xmlns:w15="http://schemas.microsoft.com/office/word/2012/wordml" xmlns:w16cex="http://schemas.microsoft.com/office/word/2018/wordml/cex" xmlns:w16cid="http://schemas.microsoft.com/office/word/2016/wordml/cid" xmlns:w16="http://schemas.microsoft.com/office/word/2018/wordml" xmlns:w16du="http://schemas.microsoft.com/office/word/2023/wordml/word16du" xmlns:w16sdtdh="http://schemas.microsoft.com/office/word/2020/wordml/sdtdatahash" xmlns:w16sdtfl="http://schemas.microsoft.com/office/word/2024/wordml/sdtformatlock" xmlns:w16se="http://schemas.microsoft.com/office/word/2015/wordml/symex" xmlns:wpg="http://schemas.microsoft.com/office/word/2010/wordprocessingGroup" xmlns:wpi="http://schemas.microsoft.com/office/word/2010/wordprocessingInk" xmlns:wne="http://schemas.microsoft.com/office/word/2006/wordml" xmlns:wps="http://schemas.microsoft.com/office/word/2010/wordprocessingShape" mc:Ignorable="w14 w15 w16se w16cid w16 w16cex w16sdtdh w16sdtfl w16du wp14">
   <w:body>
-    <w:p>
-      <w:pPr>
-        <w:pStyle w:val="Heading1"/>
-      </w:pPr>
-      <w:r>
-        <w:t>Sena Academy Curriculum — Expanded Modules &amp; Resources</w:t>
-      </w:r>
-    </w:p>
-    <w:p>
-      <w:r>
-        <w:t>This document outlines the expanded 8 modules of the Sena Academy curriculum. Each module lists the core outcomes, core concepts, skills, and context, accompanied by curated, high-quality online resources (documentation, tutorials) and video links to support both students and facilitators.</w:t>
-      </w:r>
-    </w:p>
-    <w:p>
-      <w:r>
-        <w:br w:type="page"/>
-      </w:r>
-    </w:p>
-    <w:p>
-      <w:pPr>
-        <w:pStyle w:val="Heading2"/>
-      </w:pPr>
-      <w:r>
-        <w:lastRenderedPageBreak/>
-        <w:t>Module 1 — Builder Mindset &amp; AI Foundations</w:t>
-      </w:r>
-    </w:p>
-    <w:p>
-      <w:pPr>
-        <w:pStyle w:val="ListBullet"/>
-      </w:pPr>
-      <w:r>
-        <w:t>*Outcome:** Understand how AI is changing software development and set up a modern AI development workflow.</w:t>
-      </w:r>
-    </w:p>
-    <w:p>
-      <w:pPr>
-        <w:pStyle w:val="Heading3"/>
-      </w:pPr>
-      <w:r>
-        <w:t>Core Concepts &amp; Skills</w:t>
-      </w:r>
-    </w:p>
-    <w:p>
-      <w:pPr>
-        <w:pStyle w:val="ListBullet"/>
-      </w:pPr>
-      <w:r>
-        <w:t xml:space="preserve">  </w:t>
-      </w:r>
-      <w:r>
-        <w:rPr>
-          <w:b/>
-        </w:rPr>
-        <w:t>The Builder Mindset:</w:t>
-      </w:r>
-      <w:r>
-        <w:t xml:space="preserve"> Shifting from "I need to know everything" to "I can figure it out as I build." Bias towards shipping small, working things. Comfort with ambiguity. Debugging as learning.</w:t>
-      </w:r>
-    </w:p>
-    <w:p>
-      <w:pPr>
-        <w:pStyle w:val="ListBullet"/>
-      </w:pPr>
-      <w:r>
-        <w:t xml:space="preserve">  </w:t>
-      </w:r>
-      <w:r>
-        <w:rPr>
-          <w:b/>
-        </w:rPr>
-        <w:t>AI Fundamentals:</w:t>
-      </w:r>
-      <w:r>
-        <w:t xml:space="preserve"> LLMs as pattern-completion systems. Training data cutoff vs. real-time search. Context windows. Hallucinations and verification.</w:t>
-      </w:r>
-    </w:p>
-    <w:p>
-      <w:pPr>
-        <w:pStyle w:val="ListBullet"/>
-      </w:pPr>
-      <w:r>
-        <w:t xml:space="preserve">  </w:t>
-      </w:r>
-      <w:r>
-        <w:rPr>
-          <w:b/>
-        </w:rPr>
-        <w:t>Prompt Engineering:</w:t>
-      </w:r>
-      <w:r>
-        <w:t xml:space="preserve"> Clarity, structure, context, constraints. Iterative prompting. Few-shot prompting. Chain-of-thought prompting.</w:t>
-      </w:r>
-    </w:p>
-    <w:p>
-      <w:pPr>
-        <w:pStyle w:val="ListBullet"/>
-      </w:pPr>
-      <w:r>
-        <w:t xml:space="preserve">  </w:t>
-      </w:r>
-      <w:r>
-        <w:rPr>
-          <w:b/>
-        </w:rPr>
-        <w:t>AI Developer Tools:</w:t>
-      </w:r>
-      <w:r>
-        <w:t xml:space="preserve"> General-purpose AI assistants (Claude, ChatGPT, Gemini) vs. AI-native IDEs (Cursor). Understanding when to use which.</w:t>
-      </w:r>
-    </w:p>
-    <w:p>
-      <w:pPr>
-        <w:pStyle w:val="ListBullet"/>
-      </w:pPr>
-      <w:r>
-        <w:t xml:space="preserve">  </w:t>
-      </w:r>
-      <w:r>
-        <w:rPr>
-          <w:b/>
-        </w:rPr>
-        <w:t>AI-Assisted Workflow:</w:t>
-      </w:r>
-      <w:r>
-        <w:t xml:space="preserve"> The iterative loop (describe $\rightarrow$ plan $\rightarrow$ code $\rightarrow$ test $\rightarrow$ refine). Breaking features into small testable pieces.</w:t>
-      </w:r>
-    </w:p>
-    <w:p>
-      <w:pPr>
-        <w:pStyle w:val="Heading3"/>
-      </w:pPr>
-      <w:r>
-        <w:t>Curated Online Resources &amp; Documentation</w:t>
-      </w:r>
-    </w:p>
-    <w:p>
-      <w:pPr>
-        <w:pStyle w:val="ListBullet"/>
-      </w:pPr>
-      <w:r>
-        <w:t xml:space="preserve">  </w:t>
-      </w:r>
-      <w:hyperlink r:id="rId6">
-        <w:r>
-          <w:rPr>
-            <w:color w:val="0066CC"/>
-            <w:u w:val="single"/>
-          </w:rPr>
-          <w:t>OpenAI Prompt Engineering Guide</w:t>
-        </w:r>
-      </w:hyperlink>
-      <w:r>
-        <w:t xml:space="preserve"> — The official comprehensive guide by OpenAI on prompting techniques.</w:t>
-      </w:r>
-    </w:p>
-    <w:p>
-      <w:pPr>
-        <w:pStyle w:val="ListBullet"/>
-      </w:pPr>
-      <w:r>
-        <w:t xml:space="preserve">  </w:t>
-      </w:r>
-      <w:hyperlink r:id="rId7">
-        <w:r>
-          <w:rPr>
-            <w:color w:val="0066CC"/>
-            <w:u w:val="single"/>
-          </w:rPr>
-          <w:t>Anthropic Claude Prompt Library</w:t>
-        </w:r>
-      </w:hyperlink>
-      <w:r>
-        <w:t xml:space="preserve"> — Practical prompt examples and recipes for Claude.</w:t>
-      </w:r>
-    </w:p>
-    <w:p>
-      <w:pPr>
-        <w:pStyle w:val="ListBullet"/>
-      </w:pPr>
-      <w:r>
-        <w:t xml:space="preserve">  </w:t>
-      </w:r>
-      <w:hyperlink r:id="rId8">
-        <w:r>
-          <w:rPr>
-            <w:color w:val="0066CC"/>
-            <w:u w:val="single"/>
-          </w:rPr>
-          <w:t>Cursor Learn Portal</w:t>
-        </w:r>
-      </w:hyperlink>
-      <w:r>
-        <w:t xml:space="preserve"> — Official guide to setup and command workflows in Cursor.</w:t>
-      </w:r>
-    </w:p>
-    <w:p>
-      <w:pPr>
-        <w:pStyle w:val="Heading3"/>
-      </w:pPr>
-      <w:r>
-        <w:t>Video Tutorials</w:t>
-      </w:r>
-    </w:p>
-    <w:p>
-      <w:pPr>
-        <w:pStyle w:val="ListBullet"/>
-      </w:pPr>
-      <w:r>
-        <w:t xml:space="preserve">  </w:t>
-      </w:r>
-      <w:hyperlink r:id="rId9">
-        <w:r>
-          <w:rPr>
-            <w:color w:val="0066CC"/>
-            <w:u w:val="single"/>
-          </w:rPr>
-          <w:t>Cursor AI Tutorial for Beginners (2026) - Build Apps with Vibe Coding</w:t>
-        </w:r>
-      </w:hyperlink>
-      <w:r>
-        <w:t xml:space="preserve"> — Video walkthrough of setting up and coding with Cursor.</w:t>
-      </w:r>
-    </w:p>
-    <w:p>
-      <w:pPr>
-        <w:pStyle w:val="ListBullet"/>
-      </w:pPr>
-      <w:r>
-        <w:t xml:space="preserve">  </w:t>
-      </w:r>
-      <w:hyperlink r:id="rId10">
-        <w:r>
-          <w:rPr>
-            <w:color w:val="0066CC"/>
-            <w:u w:val="single"/>
-          </w:rPr>
-          <w:t>Git and GitHub for Beginners - Crash Course</w:t>
-        </w:r>
-      </w:hyperlink>
-      <w:r>
-        <w:t xml:space="preserve"> — A full, step-by-step introduction to version control.</w:t>
-      </w:r>
-    </w:p>
-    <w:p>
-      <w:pPr>
-        <w:pStyle w:val="ListBullet"/>
-      </w:pPr>
-      <w:r>
-        <w:t xml:space="preserve">  </w:t>
-      </w:r>
-      <w:hyperlink r:id="rId11">
-        <w:r>
-          <w:rPr>
-            <w:color w:val="0066CC"/>
-            <w:u w:val="single"/>
-          </w:rPr>
-          <w:t>Introduction to Prompt Engineering &amp; LLM Basics</w:t>
-        </w:r>
-      </w:hyperlink>
-      <w:r>
-        <w:t xml:space="preserve"> — Clear video explaining context windows, hallucinations, and LLM structures.</w:t>
-      </w:r>
-    </w:p>
-    <w:p>
-      <w:r>
-        <w:br w:type="page"/>
-      </w:r>
-    </w:p>
-    <w:p>
-      <w:pPr>
-        <w:pStyle w:val="Heading2"/>
-      </w:pPr>
-      <w:r>
-        <w:lastRenderedPageBreak/>
-        <w:t>Module 2 — UI/UX Design with AI</w:t>
-      </w:r>
-    </w:p>
-    <w:p>
-      <w:pPr>
-        <w:pStyle w:val="ListBullet"/>
-      </w:pPr>
-      <w:r>
-        <w:t>*Outcome:** Design interfaces before writing code.</w:t>
-      </w:r>
-    </w:p>
-    <w:p>
-      <w:pPr>
-        <w:pStyle w:val="Heading3"/>
-      </w:pPr>
-      <w:r>
-        <w:t>Core Concepts &amp; Skills</w:t>
-      </w:r>
-    </w:p>
-    <w:p>
-      <w:pPr>
-        <w:pStyle w:val="ListBullet"/>
-      </w:pPr>
-      <w:r>
-        <w:t xml:space="preserve">  </w:t>
-      </w:r>
-      <w:r>
-        <w:rPr>
-          <w:b/>
-        </w:rPr>
-        <w:t>Design Thinking:</w:t>
-      </w:r>
-      <w:r>
-        <w:t xml:space="preserve"> Empathize, define, ideate, prototype, test. Identifying target users and pain points before starting layout.</w:t>
-      </w:r>
-    </w:p>
-    <w:p>
-      <w:pPr>
-        <w:pStyle w:val="ListBullet"/>
-      </w:pPr>
-      <w:r>
-        <w:t xml:space="preserve">  </w:t>
-      </w:r>
-      <w:r>
-        <w:rPr>
-          <w:b/>
-        </w:rPr>
-        <w:t>UI Fundamentals:</w:t>
-      </w:r>
-      <w:r>
-        <w:t xml:space="preserve"> Visual hierarchy, size, color, placement, spacing, grouping, typography readability, and color contrast.</w:t>
-      </w:r>
-    </w:p>
-    <w:p>
-      <w:pPr>
-        <w:pStyle w:val="ListBullet"/>
-      </w:pPr>
-      <w:r>
-        <w:t xml:space="preserve">  </w:t>
-      </w:r>
-      <w:r>
-        <w:rPr>
-          <w:b/>
-        </w:rPr>
-        <w:t>UX Principles:</w:t>
-      </w:r>
-      <w:r>
-        <w:t xml:space="preserve"> Usability heuristics, error prevention, cognitive load reduction, accessibility target sizes, and screen readers.</w:t>
-      </w:r>
-    </w:p>
-    <w:p>
-      <w:pPr>
-        <w:pStyle w:val="ListBullet"/>
-      </w:pPr>
-      <w:r>
-        <w:t xml:space="preserve">  </w:t>
-      </w:r>
-      <w:r>
-        <w:rPr>
-          <w:b/>
-        </w:rPr>
-        <w:t>Wireframing:</w:t>
-      </w:r>
-      <w:r>
-        <w:t xml:space="preserve"> Low-fidelity sketches, layout planning, mapping user flows between screens.</w:t>
-      </w:r>
-    </w:p>
-    <w:p>
-      <w:pPr>
-        <w:pStyle w:val="ListBullet"/>
-      </w:pPr>
-      <w:r>
-        <w:t xml:space="preserve">  </w:t>
-      </w:r>
-      <w:r>
-        <w:rPr>
-          <w:b/>
-        </w:rPr>
-        <w:t>Figma:</w:t>
-      </w:r>
-      <w:r>
-        <w:t xml:space="preserve"> Frames, responsive layout, reusable components, Auto-layout, and interactive clickable prototypes.</w:t>
-      </w:r>
-    </w:p>
-    <w:p>
-      <w:pPr>
-        <w:pStyle w:val="ListBullet"/>
-      </w:pPr>
-      <w:r>
-        <w:t xml:space="preserve">  </w:t>
-      </w:r>
-      <w:r>
-        <w:rPr>
-          <w:b/>
-        </w:rPr>
-        <w:t>Google Labs Stitch:</w:t>
-      </w:r>
-      <w:r>
-        <w:t xml:space="preserve"> Natural-language to UI creation, Standard (Text-to-UI) vs. Experimental (Sketch-to-UI) modes, exporting to Figma and HTML/CSS.</w:t>
-      </w:r>
-    </w:p>
-    <w:p>
-      <w:pPr>
-        <w:pStyle w:val="ListBullet"/>
-      </w:pPr>
-      <w:r>
-        <w:t xml:space="preserve">  </w:t>
-      </w:r>
-      <w:r>
-        <w:rPr>
-          <w:b/>
-        </w:rPr>
-        <w:t>AI-Assisted UI:</w:t>
-      </w:r>
-      <w:r>
-        <w:t xml:space="preserve"> Rapid layout generation, treatment of AI output as a first draft, manual refinement.</w:t>
-      </w:r>
-    </w:p>
-    <w:p>
-      <w:pPr>
-        <w:pStyle w:val="ListBullet"/>
-      </w:pPr>
-      <w:r>
-        <w:t xml:space="preserve">  </w:t>
-      </w:r>
-      <w:r>
-        <w:rPr>
-          <w:b/>
-        </w:rPr>
-        <w:t>Design Systems:</w:t>
-      </w:r>
-      <w:r>
-        <w:t xml:space="preserve"> Reusable color palettes, typography scale, spacing rules, and buttons/cards cohesiveness.</w:t>
-      </w:r>
-    </w:p>
-    <w:p>
-      <w:pPr>
-        <w:pStyle w:val="Heading3"/>
-      </w:pPr>
-      <w:r>
-        <w:t>Curated Online Resources &amp; Documentation</w:t>
-      </w:r>
-    </w:p>
-    <w:p>
-      <w:pPr>
-        <w:pStyle w:val="ListBullet"/>
-      </w:pPr>
-      <w:r>
-        <w:t xml:space="preserve">  </w:t>
-      </w:r>
-      <w:hyperlink r:id="rId12">
-        <w:r>
-          <w:rPr>
-            <w:color w:val="0066CC"/>
-            <w:u w:val="single"/>
-          </w:rPr>
-          <w:t>Google Stitch Web App</w:t>
-        </w:r>
-      </w:hyperlink>
-      <w:r>
-        <w:t xml:space="preserve"> — Access the official experimental AI design tool directly.</w:t>
-      </w:r>
-    </w:p>
-    <w:p>
-      <w:pPr>
-        <w:pStyle w:val="ListBullet"/>
-      </w:pPr>
-      <w:r>
-        <w:t xml:space="preserve">  </w:t>
-      </w:r>
-      <w:hyperlink r:id="rId13">
-        <w:r>
-          <w:rPr>
-            <w:color w:val="0066CC"/>
-            <w:u w:val="single"/>
-          </w:rPr>
-          <w:t>Figma Auto Layout Help Guide</w:t>
-        </w:r>
-      </w:hyperlink>
-      <w:r>
-        <w:t xml:space="preserve"> — Essential Figma documentation on building responsive components.</w:t>
-      </w:r>
-    </w:p>
-    <w:p>
-      <w:pPr>
-        <w:pStyle w:val="ListBullet"/>
-      </w:pPr>
-      <w:r>
-        <w:t xml:space="preserve">  </w:t>
-      </w:r>
-      <w:hyperlink r:id="rId14">
-        <w:r>
-          <w:rPr>
-            <w:color w:val="0066CC"/>
-            <w:u w:val="single"/>
-          </w:rPr>
-          <w:t>Stanford d.school Design Thinking Bootleg</w:t>
-        </w:r>
-      </w:hyperlink>
-      <w:r>
-        <w:t xml:space="preserve"> — Core methodology guide for Design Thinking.</w:t>
-      </w:r>
-    </w:p>
-    <w:p>
-      <w:pPr>
-        <w:pStyle w:val="ListBullet"/>
-      </w:pPr>
-      <w:r>
-        <w:t xml:space="preserve">  </w:t>
-      </w:r>
-      <w:hyperlink r:id="rId15">
-        <w:r>
-          <w:rPr>
-            <w:color w:val="0066CC"/>
-            <w:u w:val="single"/>
-          </w:rPr>
-          <w:t>Laws of UX</w:t>
-        </w:r>
-      </w:hyperlink>
-      <w:r>
-        <w:t xml:space="preserve"> — A collection of key UX design principles with visual examples.</w:t>
-      </w:r>
-    </w:p>
-    <w:p>
-      <w:pPr>
-        <w:pStyle w:val="Heading3"/>
-      </w:pPr>
-      <w:r>
-        <w:t>Video Tutorials</w:t>
-      </w:r>
-    </w:p>
-    <w:p>
-      <w:pPr>
-        <w:pStyle w:val="ListBullet"/>
-      </w:pPr>
-      <w:r>
-        <w:t xml:space="preserve">  </w:t>
-      </w:r>
-      <w:hyperlink r:id="rId16">
-        <w:r>
-          <w:rPr>
-            <w:color w:val="0066CC"/>
-            <w:u w:val="single"/>
-          </w:rPr>
-          <w:t>Google Stitch Tutorial: How to Design a Mobile App with AI in Minutes</w:t>
-        </w:r>
-      </w:hyperlink>
-      <w:r>
-        <w:t xml:space="preserve"> — Practical video walkthrough of Google Stitch.</w:t>
-      </w:r>
-    </w:p>
-    <w:p>
-      <w:pPr>
-        <w:pStyle w:val="ListBullet"/>
-      </w:pPr>
-      <w:r>
-        <w:t xml:space="preserve">  </w:t>
-      </w:r>
-      <w:hyperlink r:id="rId17">
-        <w:r>
-          <w:rPr>
-            <w:color w:val="0066CC"/>
-            <w:u w:val="single"/>
-          </w:rPr>
-          <w:t>Figma UI/UX Design Tutorial for Beginners</w:t>
-        </w:r>
-      </w:hyperlink>
-      <w:r>
-        <w:t xml:space="preserve"> — A complete course covering frames, components, auto-layout, and prototyping.</w:t>
-      </w:r>
-    </w:p>
-    <w:p>
-      <w:pPr>
-        <w:pStyle w:val="ListBullet"/>
-      </w:pPr>
-      <w:r>
-        <w:t xml:space="preserve">  </w:t>
-      </w:r>
-      <w:hyperlink r:id="rId18">
-        <w:r>
-          <w:rPr>
-            <w:color w:val="0066CC"/>
-            <w:u w:val="single"/>
-          </w:rPr>
-          <w:t>Visual Hierarchy Design Principles</w:t>
-        </w:r>
-      </w:hyperlink>
-      <w:r>
-        <w:t xml:space="preserve"> — Learn to guide user attention through typography, size, and layout.</w:t>
-      </w:r>
-    </w:p>
-    <w:p>
-      <w:r>
-        <w:br w:type="page"/>
-      </w:r>
-    </w:p>
-    <w:p>
-      <w:pPr>
-        <w:pStyle w:val="Heading2"/>
-      </w:pPr>
-      <w:r>
-        <w:lastRenderedPageBreak/>
-        <w:t>Module 3 — Website Development</w:t>
-      </w:r>
-    </w:p>
-    <w:p>
-      <w:pPr>
-        <w:pStyle w:val="ListBullet"/>
-      </w:pPr>
-      <w:r>
-        <w:t>*Outcome:** Build responsive websites using AI.</w:t>
-      </w:r>
-    </w:p>
-    <w:p>
-      <w:pPr>
-        <w:pStyle w:val="Heading3"/>
-      </w:pPr>
-      <w:r>
-        <w:t>Core Concepts &amp; Skills</w:t>
-      </w:r>
-    </w:p>
-    <w:p>
-      <w:pPr>
-        <w:pStyle w:val="ListBullet"/>
-      </w:pPr>
-      <w:r>
-        <w:t xml:space="preserve">  </w:t>
-      </w:r>
-      <w:r>
-        <w:rPr>
-          <w:b/>
-        </w:rPr>
-        <w:t>HTML:</w:t>
-      </w:r>
-      <w:r>
-        <w:t xml:space="preserve"> Semantic tags (header, nav, article, section, footer), form tags, nested document structure, media embedding.</w:t>
-      </w:r>
-    </w:p>
-    <w:p>
-      <w:pPr>
-        <w:pStyle w:val="ListBullet"/>
-      </w:pPr>
-      <w:r>
-        <w:t xml:space="preserve">  </w:t>
-      </w:r>
-      <w:r>
-        <w:rPr>
-          <w:b/>
-        </w:rPr>
-        <w:t>CSS:</w:t>
-      </w:r>
-      <w:r>
-        <w:t xml:space="preserve"> The Box Model (content, padding, border, margin), Flexbox, CSS Grid layouts, and utility styling using Tailwind CSS.</w:t>
-      </w:r>
-    </w:p>
-    <w:p>
-      <w:pPr>
-        <w:pStyle w:val="ListBullet"/>
-      </w:pPr>
-      <w:r>
-        <w:t xml:space="preserve">  </w:t>
-      </w:r>
-      <w:r>
-        <w:rPr>
-          <w:b/>
-        </w:rPr>
-        <w:t>JavaScript:</w:t>
-      </w:r>
-      <w:r>
-        <w:t xml:space="preserve"> Variable declarations, loops, conditionals, functions, DOM selection/manipulation, event handling, Fetch API, and async/await.</w:t>
-      </w:r>
-    </w:p>
-    <w:p>
-      <w:pPr>
-        <w:pStyle w:val="ListBullet"/>
-      </w:pPr>
-      <w:r>
-        <w:t xml:space="preserve">  </w:t>
-      </w:r>
-      <w:r>
-        <w:rPr>
-          <w:b/>
-        </w:rPr>
-        <w:t>Responsive Design:</w:t>
-      </w:r>
-      <w:r>
-        <w:t xml:space="preserve"> Media queries, mobile-first strategies, fluid layouts, viewport testing.</w:t>
-      </w:r>
-    </w:p>
-    <w:p>
-      <w:pPr>
-        <w:pStyle w:val="ListBullet"/>
-      </w:pPr>
-      <w:r>
-        <w:t xml:space="preserve">  </w:t>
-      </w:r>
-      <w:r>
-        <w:rPr>
-          <w:b/>
-        </w:rPr>
-        <w:t>AI-Assisted Frontend:</w:t>
-      </w:r>
-      <w:r>
-        <w:t xml:space="preserve"> Cursor/Claude code generation, design-to-code translation, layout debugging, review and refactoring.</w:t>
-      </w:r>
-    </w:p>
-    <w:p>
-      <w:pPr>
-        <w:pStyle w:val="ListBullet"/>
-      </w:pPr>
-      <w:r>
-        <w:t xml:space="preserve">  </w:t>
-      </w:r>
-      <w:r>
-        <w:rPr>
-          <w:b/>
-        </w:rPr>
-        <w:t>Deployment:</w:t>
-      </w:r>
-      <w:r>
-        <w:t xml:space="preserve"> Hosting static sites (Vercel, Netlify), connecting custom domains, setting up DNS, CI/CD auto-deployment via GitHub.</w:t>
-      </w:r>
-    </w:p>
-    <w:p>
-      <w:pPr>
-        <w:pStyle w:val="ListBullet"/>
-      </w:pPr>
-      <w:r>
-        <w:br/>
-      </w:r>
-      <w:r>
-        <w:t xml:space="preserve">  </w:t>
-      </w:r>
-      <w:r>
-        <w:rPr>
-          <w:b/>
-        </w:rPr>
-        <w:t>Version Control &amp; Env Setup:</w:t>
-      </w:r>
-      <w:r>
-        <w:t xml:space="preserve"> Git commands, GitHub setup, pull requests, issues, READMEs. Local runtime environment (Node.js, IDE setup).</w:t>
-      </w:r>
-    </w:p>
-    <w:p>
-      <w:pPr>
-        <w:pStyle w:val="ListBullet"/>
-      </w:pPr>
-      <w:r>
-        <w:t xml:space="preserve">  </w:t>
-      </w:r>
-      <w:r>
-        <w:rPr>
-          <w:b/>
-        </w:rPr>
-        <w:t>GitHub Optimization:</w:t>
-      </w:r>
-      <w:r>
-        <w:t xml:space="preserve"> Clear profile READMEs, clean repository directories, descriptive commit messages, project tags.</w:t>
-      </w:r>
-    </w:p>
-    <w:p>
-      <w:pPr>
-        <w:pStyle w:val="ListBullet"/>
-        <w:numPr>
-          <w:ilvl w:val="0"/>
-          <w:numId w:val="0"/>
-        </w:numPr>
-        <w:ind w:left="360"/>
-      </w:pPr>
-    </w:p>
-    <w:p>
-      <w:pPr>
-        <w:pStyle w:val="Heading3"/>
-      </w:pPr>
-      <w:r>
-        <w:t>Curated Online Resources &amp; Documentation</w:t>
-      </w:r>
-    </w:p>
-    <w:p>
-      <w:pPr>
-        <w:pStyle w:val="ListBullet"/>
-      </w:pPr>
-      <w:r>
-        <w:t xml:space="preserve">  </w:t>
-      </w:r>
-      <w:hyperlink r:id="rId19">
-        <w:r>
-          <w:rPr>
-            <w:color w:val="0066CC"/>
-            <w:u w:val="single"/>
-          </w:rPr>
-          <w:t>MDN Web Docs: CSS Layouts</w:t>
-        </w:r>
-      </w:hyperlink>
-      <w:r>
-        <w:t xml:space="preserve"> — The comprehensive guide on Flexbox, CSS Grid, and responsive web design.</w:t>
-      </w:r>
-    </w:p>
-    <w:p>
-      <w:pPr>
-        <w:pStyle w:val="ListBullet"/>
-      </w:pPr>
-      <w:r>
-        <w:t xml:space="preserve">  </w:t>
-      </w:r>
-      <w:hyperlink r:id="rId20">
-        <w:r>
-          <w:rPr>
-            <w:color w:val="0066CC"/>
-            <w:u w:val="single"/>
-          </w:rPr>
-          <w:t>Tailwind CSS Official Documentation</w:t>
-        </w:r>
-      </w:hyperlink>
-      <w:r>
-        <w:t xml:space="preserve"> — Searchable utility classes and design system definitions.</w:t>
-      </w:r>
-    </w:p>
-    <w:p>
-      <w:pPr>
-        <w:pStyle w:val="ListBullet"/>
-      </w:pPr>
-      <w:r>
-        <w:t xml:space="preserve">  </w:t>
-      </w:r>
-      <w:hyperlink r:id="rId21">
-        <w:r>
-          <w:rPr>
-            <w:color w:val="0066CC"/>
-            <w:u w:val="single"/>
-          </w:rPr>
-          <w:t>JavaScript info: DOM Tree</w:t>
-        </w:r>
-      </w:hyperlink>
-      <w:r>
-        <w:t xml:space="preserve"> — Excellent resource for learning JavaScript DOM manipulation.</w:t>
-      </w:r>
-    </w:p>
-    <w:p>
-      <w:pPr>
-        <w:pStyle w:val="ListBullet"/>
-      </w:pPr>
-      <w:r>
-        <w:t xml:space="preserve">  </w:t>
-      </w:r>
-      <w:hyperlink r:id="rId22">
-        <w:r>
-          <w:rPr>
-            <w:color w:val="0066CC"/>
-            <w:u w:val="single"/>
-          </w:rPr>
-          <w:t>Vercel Quickstart Deployment Docs</w:t>
-        </w:r>
-      </w:hyperlink>
-      <w:r>
-        <w:t xml:space="preserve"> — Official guide on deploying projects from Git </w:t>
-      </w:r>
-    </w:p>
-    <w:p>
-      <w:pPr>
-        <w:pStyle w:val="ListBullet"/>
-        <w:numPr>
-          <w:ilvl w:val="0"/>
-          <w:numId w:val="0"/>
-        </w:numPr>
-        <w:ind w:left="360"/>
-      </w:pPr>
-      <w:r>
-        <w:t>repositories.</w:t>
-      </w:r>
-    </w:p>
-    <w:p>
-      <w:pPr>
-        <w:pStyle w:val="ListBullet"/>
-      </w:pPr>
-      <w:r>
-        <w:t xml:space="preserve">  </w:t>
-      </w:r>
-      <w:hyperlink r:id="rId23">
-        <w:r>
-          <w:rPr>
-            <w:color w:val="0066CC"/>
-            <w:u w:val="single"/>
-          </w:rPr>
-          <w:t>GitHub Git Handbook</w:t>
-        </w:r>
-      </w:hyperlink>
-      <w:r>
-        <w:t xml:space="preserve"> — Official, beginner-friendly guide to Git and GitHub version control.</w:t>
-      </w:r>
-    </w:p>
-    <w:p>
-      <w:pPr>
-        <w:pStyle w:val="ListBullet"/>
-        <w:numPr>
-          <w:ilvl w:val="0"/>
-          <w:numId w:val="0"/>
-        </w:numPr>
-        <w:ind w:left="360" w:hanging="360"/>
-      </w:pPr>
-    </w:p>
-    <w:p>
-      <w:pPr>
-        <w:pStyle w:val="Heading3"/>
-      </w:pPr>
-      <w:r>
-        <w:t>Video Tutorials</w:t>
-      </w:r>
-    </w:p>
-    <w:p>
-      <w:pPr>
-        <w:pStyle w:val="ListBullet"/>
-      </w:pPr>
-      <w:r>
-        <w:t xml:space="preserve">  </w:t>
-      </w:r>
-      <w:hyperlink r:id="rId24">
-        <w:r>
-          <w:rPr>
-            <w:color w:val="0066CC"/>
-            <w:u w:val="single"/>
-          </w:rPr>
-          <w:t>Tailwind CSS Full Course for Beginners</w:t>
-        </w:r>
-      </w:hyperlink>
-      <w:r>
-        <w:t xml:space="preserve"> — Dave Gray's 3-hour deep dive into Tailwind CSS.</w:t>
-      </w:r>
-    </w:p>
-    <w:p>
-      <w:pPr>
-        <w:pStyle w:val="ListBullet"/>
-      </w:pPr>
-      <w:r>
-        <w:t xml:space="preserve">  </w:t>
-      </w:r>
-      <w:hyperlink r:id="rId25">
-        <w:r>
-          <w:rPr>
-            <w:color w:val="0066CC"/>
-            <w:u w:val="single"/>
-          </w:rPr>
-          <w:t>Learn DOM Manipulation In 18 Minutes</w:t>
-        </w:r>
-      </w:hyperlink>
-      <w:r>
-        <w:t xml:space="preserve"> — Web Dev Simplified's tutorial on dynamic Javascript updates.</w:t>
-      </w:r>
-    </w:p>
-    <w:p>
-      <w:pPr>
-        <w:pStyle w:val="ListBullet"/>
-      </w:pPr>
-      <w:r>
-        <w:t xml:space="preserve">  </w:t>
-      </w:r>
-      <w:hyperlink r:id="rId26">
-        <w:r>
-          <w:rPr>
-            <w:color w:val="0066CC"/>
-            <w:u w:val="single"/>
-          </w:rPr>
-          <w:t>Deploying a Website to Vercel (Beginner Tutorial)</w:t>
-        </w:r>
-      </w:hyperlink>
-      <w:r>
-        <w:t xml:space="preserve"> — Easy guide on connecting GitHub and deploying a live website.</w:t>
-      </w:r>
-    </w:p>
-    <w:p>
-      <w:r>
-        <w:br w:type="page"/>
-      </w:r>
-    </w:p>
-    <w:p>
-      <w:pPr>
-        <w:pStyle w:val="Heading2"/>
-      </w:pPr>
-      <w:r>
-        <w:lastRenderedPageBreak/>
-        <w:t>Module 4 — Android App Development</w:t>
-      </w:r>
-    </w:p>
-    <w:p>
-      <w:pPr>
-        <w:pStyle w:val="ListBullet"/>
-      </w:pPr>
-      <w:r>
-        <w:t>*Outcome:** Build modern Android applications.</w:t>
-      </w:r>
-    </w:p>
-    <w:p>
-      <w:pPr>
-        <w:pStyle w:val="Heading3"/>
-      </w:pPr>
-      <w:r>
-        <w:t>Core Concepts &amp; Skills</w:t>
-      </w:r>
-    </w:p>
-    <w:p>
-      <w:pPr>
-        <w:pStyle w:val="ListBullet"/>
-      </w:pPr>
-      <w:r>
-        <w:t xml:space="preserve">  </w:t>
-      </w:r>
-      <w:r>
-        <w:rPr>
-          <w:b/>
-        </w:rPr>
-        <w:t>Flutter:</w:t>
-      </w:r>
-      <w:r>
-        <w:t xml:space="preserve"> Cross-platform SDK, Widget-based composition (Stateless vs. Stateful), hot reload development cycle.</w:t>
-      </w:r>
-    </w:p>
-    <w:p>
-      <w:pPr>
-        <w:pStyle w:val="ListBullet"/>
-      </w:pPr>
-      <w:r>
-        <w:t xml:space="preserve">  </w:t>
-      </w:r>
-      <w:r>
-        <w:rPr>
-          <w:b/>
-        </w:rPr>
-        <w:t>Dart:</w:t>
-      </w:r>
-      <w:r>
-        <w:t xml:space="preserve"> Strong typing, classes, OOP, async programming (Futures, async/await), and state management patterns.</w:t>
-      </w:r>
-    </w:p>
-    <w:p>
-      <w:pPr>
-        <w:pStyle w:val="ListBullet"/>
-      </w:pPr>
-      <w:r>
-        <w:t xml:space="preserve">  </w:t>
-      </w:r>
-      <w:r>
-        <w:rPr>
-          <w:b/>
-        </w:rPr>
-        <w:t>Firebase Integration:</w:t>
-      </w:r>
-      <w:r>
-        <w:t xml:space="preserve"> Authentication, Cloud Firestore (NoSQL), Storage, and serverless infrastructure.</w:t>
-      </w:r>
-    </w:p>
-    <w:p>
-      <w:pPr>
-        <w:pStyle w:val="ListBullet"/>
-      </w:pPr>
-      <w:r>
-        <w:t xml:space="preserve">  </w:t>
-      </w:r>
-      <w:r>
-        <w:rPr>
-          <w:b/>
-        </w:rPr>
-        <w:t>Authentication:</w:t>
-      </w:r>
-      <w:r>
-        <w:t xml:space="preserve"> Registration/login with email/password, auth state streams, persistence across sessions.</w:t>
-      </w:r>
-    </w:p>
-    <w:p>
-      <w:pPr>
-        <w:pStyle w:val="ListBullet"/>
-      </w:pPr>
-      <w:r>
-        <w:t xml:space="preserve">  </w:t>
-      </w:r>
-      <w:r>
-        <w:rPr>
-          <w:b/>
-        </w:rPr>
-        <w:t>Database Integration:</w:t>
-      </w:r>
-      <w:r>
-        <w:t xml:space="preserve"> Document structure in Firestore, CRUD operations from Flutter, handling user-specific permissions.</w:t>
-      </w:r>
-    </w:p>
-    <w:p>
-      <w:pPr>
-        <w:pStyle w:val="ListBullet"/>
-      </w:pPr>
-      <w:r>
-        <w:t xml:space="preserve">  </w:t>
-      </w:r>
-      <w:r>
-        <w:rPr>
-          <w:b/>
-        </w:rPr>
-        <w:t>API Consumption:</w:t>
-      </w:r>
-      <w:r>
-        <w:t xml:space="preserve"> Making HTTP REST requests, processing JSON payloads, displaying loading, empty, and error UI states.</w:t>
-      </w:r>
-    </w:p>
-    <w:p>
-      <w:pPr>
-        <w:pStyle w:val="ListBullet"/>
-      </w:pPr>
-      <w:r>
-        <w:t xml:space="preserve">  </w:t>
-      </w:r>
-      <w:r>
-        <w:rPr>
-          <w:b/>
-        </w:rPr>
-        <w:t>Publishing Workflow:</w:t>
-      </w:r>
-      <w:r>
-        <w:t xml:space="preserve"> App configuration (icons, splash screen, version numbers), Google Play Console setup, review guidelines.</w:t>
-      </w:r>
-    </w:p>
-    <w:p>
-      <w:pPr>
-        <w:pStyle w:val="Heading3"/>
-      </w:pPr>
-      <w:r>
-        <w:t>Curated Online Resources &amp; Documentation</w:t>
-      </w:r>
-    </w:p>
-    <w:p>
-      <w:pPr>
-        <w:pStyle w:val="ListBullet"/>
-      </w:pPr>
-      <w:r>
-        <w:t xml:space="preserve">  </w:t>
-      </w:r>
-      <w:hyperlink r:id="rId27">
-        <w:r>
-          <w:rPr>
-            <w:color w:val="0066CC"/>
-            <w:u w:val="single"/>
-          </w:rPr>
-          <w:t>Flutterfire Official Guides</w:t>
-        </w:r>
-      </w:hyperlink>
-      <w:r>
-        <w:t xml:space="preserve"> — The definitive setup and package guides for Firebase in Flutter.</w:t>
-      </w:r>
-    </w:p>
-    <w:p>
-      <w:pPr>
-        <w:pStyle w:val="ListBullet"/>
-      </w:pPr>
-      <w:r>
-        <w:t xml:space="preserve">  </w:t>
-      </w:r>
-      <w:hyperlink r:id="rId28">
-        <w:r>
-          <w:rPr>
-            <w:color w:val="0066CC"/>
-            <w:u w:val="single"/>
-          </w:rPr>
-          <w:t>Dart Programming Language Tour</w:t>
-        </w:r>
-      </w:hyperlink>
-      <w:r>
-        <w:t xml:space="preserve"> — Official syntax reference for the Dart language.</w:t>
-      </w:r>
-    </w:p>
-    <w:p>
-      <w:pPr>
-        <w:pStyle w:val="ListBullet"/>
-      </w:pPr>
-      <w:r>
-        <w:t xml:space="preserve">  </w:t>
-      </w:r>
-      <w:hyperlink r:id="rId29">
-        <w:r>
-          <w:rPr>
-            <w:color w:val="0066CC"/>
-            <w:u w:val="single"/>
-          </w:rPr>
-          <w:t>Flutter Widget Catalog</w:t>
-        </w:r>
-      </w:hyperlink>
-      <w:r>
-        <w:t xml:space="preserve"> — Gallery of core built-in Flutter UI widgets.</w:t>
-      </w:r>
-    </w:p>
-    <w:p>
-      <w:pPr>
-        <w:pStyle w:val="ListBullet"/>
-      </w:pPr>
-      <w:r>
-        <w:t xml:space="preserve">  </w:t>
-      </w:r>
-      <w:hyperlink r:id="rId30">
-        <w:r>
-          <w:rPr>
-            <w:color w:val="0066CC"/>
-            <w:u w:val="single"/>
-          </w:rPr>
-          <w:t>Google Play App Submission Checklist</w:t>
-        </w:r>
-      </w:hyperlink>
-      <w:r>
-        <w:t xml:space="preserve"> — Official Android Studio guide to prepare applications for Play Store publishing.</w:t>
-      </w:r>
-    </w:p>
-    <w:p>
-      <w:pPr>
-        <w:pStyle w:val="Heading3"/>
-      </w:pPr>
-      <w:r>
-        <w:t>Video Tutorials</w:t>
-      </w:r>
-    </w:p>
-    <w:p>
-      <w:pPr>
-        <w:pStyle w:val="ListBullet"/>
-      </w:pPr>
-      <w:r>
-        <w:t xml:space="preserve">  </w:t>
-      </w:r>
-      <w:hyperlink r:id="rId31">
-        <w:r>
-          <w:rPr>
-            <w:color w:val="0066CC"/>
-            <w:u w:val="single"/>
-          </w:rPr>
-          <w:t>Flutter Crash Course for Beginners</w:t>
-        </w:r>
-      </w:hyperlink>
-      <w:r>
-        <w:t xml:space="preserve"> — Quickstart tutorial on Dart, widgets, and state management.</w:t>
-      </w:r>
-    </w:p>
-    <w:p>
-      <w:pPr>
-        <w:pStyle w:val="ListBullet"/>
-      </w:pPr>
-      <w:r>
-        <w:t xml:space="preserve">  </w:t>
-      </w:r>
-      <w:hyperlink r:id="rId32">
-        <w:r>
-          <w:rPr>
-            <w:color w:val="0066CC"/>
-            <w:u w:val="single"/>
-          </w:rPr>
-          <w:t>Flutter Firebase Authentication &amp; Firestore Tutorial</w:t>
-        </w:r>
-      </w:hyperlink>
-      <w:r>
-        <w:t xml:space="preserve"> — Step-by-step setup of Firebase backend database with Flutter.</w:t>
-      </w:r>
-    </w:p>
-    <w:p>
-      <w:pPr>
-        <w:pStyle w:val="ListBullet"/>
-      </w:pPr>
-      <w:r>
-        <w:t xml:space="preserve">  </w:t>
-      </w:r>
-      <w:hyperlink r:id="rId33">
-        <w:r>
-          <w:rPr>
-            <w:color w:val="0066CC"/>
-            <w:u w:val="single"/>
-          </w:rPr>
-          <w:t>Working with APIs in Flutter (http &amp; json)</w:t>
-        </w:r>
-      </w:hyperlink>
-      <w:r>
-        <w:t xml:space="preserve"> — How to query HTTP APIs and render JSON data dynamically.</w:t>
-      </w:r>
-    </w:p>
-    <w:p>
-      <w:r>
-        <w:br w:type="page"/>
-      </w:r>
-    </w:p>
-    <w:p>
-      <w:pPr>
-        <w:pStyle w:val="Heading2"/>
-      </w:pPr>
-      <w:r>
-        <w:lastRenderedPageBreak/>
-        <w:t>Module 5 — Backend Development</w:t>
-      </w:r>
-    </w:p>
-    <w:p>
-      <w:pPr>
-        <w:pStyle w:val="ListBullet"/>
-      </w:pPr>
-      <w:r>
-        <w:t>*Outcome:** Build scalable backends.</w:t>
-      </w:r>
-    </w:p>
-    <w:p>
-      <w:pPr>
-        <w:pStyle w:val="Heading3"/>
-      </w:pPr>
-      <w:r>
-        <w:t>Core Concepts &amp; Skills</w:t>
-      </w:r>
-    </w:p>
-    <w:p>
-      <w:pPr>
-        <w:pStyle w:val="ListBullet"/>
-      </w:pPr>
-      <w:r>
-        <w:t xml:space="preserve">  </w:t>
-      </w:r>
-      <w:r>
-        <w:rPr>
-          <w:b/>
-        </w:rPr>
-        <w:t>APIs:</w:t>
-      </w:r>
-      <w:r>
-        <w:t xml:space="preserve"> REST architecture, HTTP methods (GET, POST, PUT, DELETE), status codes, path parameters, request headers.</w:t>
-      </w:r>
-    </w:p>
-    <w:p>
-      <w:pPr>
-        <w:pStyle w:val="ListBullet"/>
-      </w:pPr>
-      <w:r>
-        <w:t xml:space="preserve">  </w:t>
-      </w:r>
-      <w:r>
-        <w:rPr>
-          <w:b/>
-        </w:rPr>
-        <w:t>FastAPI:</w:t>
-      </w:r>
-      <w:r>
-        <w:t xml:space="preserve"> Python types validation, automatic OpenAPI (Swagger) generation, Pydantic schemas, route definitions.</w:t>
-      </w:r>
-    </w:p>
-    <w:p>
-      <w:pPr>
-        <w:pStyle w:val="ListBullet"/>
-      </w:pPr>
-      <w:r>
-        <w:t xml:space="preserve">  </w:t>
-      </w:r>
-      <w:r>
-        <w:rPr>
-          <w:b/>
-        </w:rPr>
-        <w:t>Databases:</w:t>
-      </w:r>
-      <w:r>
-        <w:t xml:space="preserve"> Relational PostgreSQL, tables, schemas, relations (one-to-many, many-to-many), SQLAlchemy ORM.</w:t>
-      </w:r>
-    </w:p>
-    <w:p>
-      <w:pPr>
-        <w:pStyle w:val="ListBullet"/>
-      </w:pPr>
-      <w:r>
-        <w:t xml:space="preserve">  </w:t>
-      </w:r>
-      <w:r>
-        <w:rPr>
-          <w:b/>
-        </w:rPr>
-        <w:t>Authentication:</w:t>
-      </w:r>
-      <w:r>
-        <w:t xml:space="preserve"> Password cryptography (bcrypt), JSON Web Tokens (JWT), token generation, route protection dependencies</w:t>
-      </w:r>
-    </w:p>
-    <w:p>
-      <w:pPr>
-        <w:pStyle w:val="ListBullet"/>
-      </w:pPr>
-      <w:r>
-        <w:rPr>
-          <w:b/>
-        </w:rPr>
-        <w:t>CRUD Operations:</w:t>
-      </w:r>
-      <w:r>
-        <w:t xml:space="preserve"> Query execution, user input validation, relationship mappings, error handling (</w:t>
-      </w:r>
-      <w:proofErr w:type="spellStart"/>
-      <w:r>
-        <w:t>HTTPException</w:t>
-      </w:r>
-      <w:proofErr w:type="spellEnd"/>
-      <w:r>
-        <w:t>).</w:t>
-      </w:r>
-      <w:r>
-        <w:t xml:space="preserve"> </w:t>
-      </w:r>
-      <w:r>
-        <w:t>Core Concepts &amp; Skills</w:t>
-      </w:r>
-    </w:p>
-    <w:p>
-      <w:pPr>
-        <w:pStyle w:val="ListBullet"/>
-      </w:pPr>
-      <w:r>
-        <w:t xml:space="preserve">  </w:t>
-      </w:r>
-      <w:r>
-        <w:rPr>
-          <w:b/>
-        </w:rPr>
-        <w:t>OpenAI, Claude, &amp; Gemini APIs:</w:t>
-      </w:r>
-      <w:r>
-        <w:t xml:space="preserve"> Auth headers, model parameters (temperature, max tokens), pricing metrics (input vs. output tokens).</w:t>
-      </w:r>
-    </w:p>
-    <w:p>
-      <w:pPr>
-        <w:pStyle w:val="ListBullet"/>
-      </w:pPr>
-    </w:p>
-    <w:p>
-      <w:pPr>
-        <w:pStyle w:val="ListBullet"/>
-      </w:pPr>
-      <w:r>
-        <w:t xml:space="preserve">  </w:t>
-      </w:r>
-      <w:r>
-        <w:rPr>
-          <w:b/>
-        </w:rPr>
-        <w:t>AI-Assisted Backend:</w:t>
-      </w:r>
-      <w:r>
-        <w:t xml:space="preserve"> Auto-generating database models, routing templates, security vulnerability audits.</w:t>
-      </w:r>
-      <w:r>
-        <w:t xml:space="preserve"> </w:t>
-      </w:r>
-      <w:r>
-        <w:br/>
-      </w:r>
-      <w:r>
-        <w:br/>
-      </w:r>
-      <w:r>
-        <w:br/>
-      </w:r>
-    </w:p>
-    <w:p>
-      <w:pPr>
-        <w:pStyle w:val="Heading3"/>
-      </w:pPr>
-      <w:r>
-        <w:t>Curated Online Resources &amp; Documentation</w:t>
-      </w:r>
-    </w:p>
-    <w:p>
-      <w:pPr>
-        <w:pStyle w:val="ListBullet"/>
-      </w:pPr>
-      <w:r>
-        <w:t xml:space="preserve">  </w:t>
-      </w:r>
-      <w:hyperlink r:id="rId34">
-        <w:r>
-          <w:rPr>
-            <w:color w:val="0066CC"/>
-            <w:u w:val="single"/>
-          </w:rPr>
-          <w:t>FastAPI Official Documentation</w:t>
-        </w:r>
-      </w:hyperlink>
-      <w:r>
-        <w:t xml:space="preserve"> — The interactive web framework's official docs.</w:t>
-      </w:r>
-    </w:p>
-    <w:p>
-      <w:pPr>
-        <w:pStyle w:val="ListBullet"/>
-      </w:pPr>
-      <w:r>
-        <w:t xml:space="preserve">  </w:t>
-      </w:r>
-      <w:hyperlink r:id="rId35">
-        <w:r>
-          <w:rPr>
-            <w:color w:val="0066CC"/>
-            <w:u w:val="single"/>
-          </w:rPr>
-          <w:t>SQLAlchemy Database Guide</w:t>
-        </w:r>
-      </w:hyperlink>
-      <w:r>
-        <w:t xml:space="preserve"> — FastAPI integration guide with SQLAlchemy and Postgres.</w:t>
-      </w:r>
-    </w:p>
-    <w:p>
-      <w:pPr>
-        <w:pStyle w:val="ListBullet"/>
-      </w:pPr>
-      <w:r>
-        <w:t xml:space="preserve">  </w:t>
-      </w:r>
-      <w:hyperlink r:id="rId36">
-        <w:r>
-          <w:rPr>
-            <w:color w:val="0066CC"/>
-            <w:u w:val="single"/>
-          </w:rPr>
-          <w:t>PostgreSQL Tutorial</w:t>
-        </w:r>
-      </w:hyperlink>
-      <w:r>
-        <w:t xml:space="preserve"> — Practical, clear tutorials for learning PostgreSQL relational concepts.</w:t>
-      </w:r>
-    </w:p>
-    <w:p>
-      <w:pPr>
-        <w:pStyle w:val="Heading3"/>
-      </w:pPr>
-      <w:r>
-        <w:t>Video Tutorials</w:t>
-      </w:r>
-    </w:p>
-    <w:p>
-      <w:pPr>
-        <w:pStyle w:val="ListBullet"/>
-      </w:pPr>
-      <w:r>
-        <w:t xml:space="preserve">  </w:t>
-      </w:r>
-      <w:hyperlink r:id="rId37">
-        <w:r>
-          <w:rPr>
-            <w:color w:val="0066CC"/>
-            <w:u w:val="single"/>
-          </w:rPr>
-          <w:t>Python FastAPI JWT Authentication - Complete User CRUD Tutorial</w:t>
-        </w:r>
-      </w:hyperlink>
-      <w:r>
-        <w:t xml:space="preserve"> — Step-by-step implementation of JWT signup/login with PostgreSQL.</w:t>
-      </w:r>
-    </w:p>
-    <w:p>
-      <w:pPr>
-        <w:pStyle w:val="ListBullet"/>
-      </w:pPr>
-      <w:r>
-        <w:t xml:space="preserve">  </w:t>
-      </w:r>
-      <w:hyperlink r:id="rId38">
-        <w:r>
-          <w:rPr>
-            <w:color w:val="0066CC"/>
-            <w:u w:val="single"/>
-          </w:rPr>
-          <w:t>FastAPI Crash Course for Beginners</w:t>
-        </w:r>
-      </w:hyperlink>
-      <w:r>
-        <w:t xml:space="preserve"> — Introduction to building API endpoints and handling requests.</w:t>
-      </w:r>
-    </w:p>
-    <w:p>
-      <w:pPr>
-        <w:pStyle w:val="ListBullet"/>
-      </w:pPr>
-      <w:r>
-        <w:t xml:space="preserve">  </w:t>
-      </w:r>
-      <w:hyperlink r:id="rId39">
-        <w:r>
-          <w:rPr>
-            <w:color w:val="0066CC"/>
-            <w:u w:val="single"/>
-          </w:rPr>
-          <w:t>Relational Databases &amp; SQL Essentials in 60 Minutes</w:t>
-        </w:r>
-      </w:hyperlink>
-      <w:r>
-        <w:t xml:space="preserve"> — SQL basics, tables, relationships, and queries.</w:t>
-      </w:r>
-    </w:p>
-    <w:p>
-      <w:r>
-        <w:br w:type="page"/>
-      </w:r>
-    </w:p>
-    <w:p>
-      <w:r>
-        <w:lastRenderedPageBreak/>
-        <w:br w:type="page"/>
-      </w:r>
-    </w:p>
-    <w:p>
-      <w:pPr>
-        <w:pStyle w:val="Heading2"/>
-      </w:pPr>
-      <w:r>
-        <w:lastRenderedPageBreak/>
-        <w:t>Module 7 — Product Development</w:t>
-      </w:r>
-    </w:p>
-    <w:p>
-      <w:pPr>
-        <w:pStyle w:val="ListBullet"/>
-      </w:pPr>
-      <w:r>
-        <w:t>*</w:t>
-      </w:r>
-      <w:proofErr w:type="gramStart"/>
-      <w:r>
-        <w:t>Outcome:*</w:t>
-      </w:r>
-      <w:proofErr w:type="gramEnd"/>
-      <w:r>
-        <w:t xml:space="preserve">* Build software people can </w:t>
-      </w:r>
-      <w:proofErr w:type="gramStart"/>
-      <w:r>
-        <w:t>actually use</w:t>
-      </w:r>
-      <w:proofErr w:type="gramEnd"/>
-      <w:r>
-        <w:t>.</w:t>
-      </w:r>
-    </w:p>
-    <w:p>
-      <w:pPr>
-        <w:pStyle w:val="Heading3"/>
-      </w:pPr>
-      <w:r>
-        <w:t>Core Concepts &amp; Skills</w:t>
-      </w:r>
-    </w:p>
-    <w:p>
-      <w:pPr>
-        <w:pStyle w:val="ListBullet"/>
-      </w:pPr>
-      <w:r>
-        <w:t xml:space="preserve">  </w:t>
-      </w:r>
-      <w:r>
-        <w:rPr>
-          <w:b/>
-        </w:rPr>
-        <w:t>Product Thinking:</w:t>
-      </w:r>
-      <w:r>
-        <w:t xml:space="preserve"> Solving user pain points repeatedly, prioritization matrix, differentiating features vs. products.</w:t>
-      </w:r>
-    </w:p>
-    <w:p>
-      <w:pPr>
-        <w:pStyle w:val="ListBullet"/>
-      </w:pPr>
-      <w:r>
-        <w:t xml:space="preserve">  </w:t>
-      </w:r>
-      <w:r>
-        <w:rPr>
-          <w:b/>
-        </w:rPr>
-        <w:t>MVP Development:</w:t>
-      </w:r>
-      <w:r>
-        <w:t xml:space="preserve"> Scoping MVP, feature cutting, rapid implementation cycles, core value proposition.</w:t>
-      </w:r>
-    </w:p>
-    <w:p>
-      <w:pPr>
-        <w:pStyle w:val="ListBullet"/>
-      </w:pPr>
-      <w:r>
-        <w:t xml:space="preserve">  </w:t>
-      </w:r>
-      <w:r>
-        <w:rPr>
-          <w:b/>
-        </w:rPr>
-        <w:t>User Feedback:</w:t>
-      </w:r>
-      <w:r>
-        <w:t xml:space="preserve"> The Mom Test interview, behavior observation sessions, user logs analysis, parsing feedback.</w:t>
-      </w:r>
-    </w:p>
-    <w:p>
-      <w:pPr>
-        <w:pStyle w:val="ListBullet"/>
-      </w:pPr>
-      <w:r>
-        <w:t xml:space="preserve">  </w:t>
-      </w:r>
-      <w:r>
-        <w:rPr>
-          <w:b/>
-        </w:rPr>
-        <w:t>QA &amp; Testing:</w:t>
-      </w:r>
-      <w:r>
-        <w:t xml:space="preserve"> Manual QA smoke testing, automated testing basics, catching UI regressions.</w:t>
-      </w:r>
-    </w:p>
-    <w:p>
-      <w:pPr>
-        <w:pStyle w:val="ListBullet"/>
-      </w:pPr>
-      <w:r>
-        <w:t xml:space="preserve">  </w:t>
-      </w:r>
-      <w:r>
-        <w:rPr>
-          <w:b/>
-        </w:rPr>
-        <w:t>Iteration &amp; Deployment:</w:t>
-      </w:r>
-      <w:r>
-        <w:t xml:space="preserve"> Incremental software delivery, CI/CD pipelines, staging vs. production.</w:t>
-      </w:r>
-    </w:p>
-    <w:p>
-      <w:pPr>
-        <w:pStyle w:val="Heading3"/>
-      </w:pPr>
-      <w:r>
-        <w:t>Curated Online Resources &amp; Documentation</w:t>
-      </w:r>
-    </w:p>
-    <w:p>
-      <w:pPr>
-        <w:pStyle w:val="ListBullet"/>
-      </w:pPr>
-      <w:r>
-        <w:t xml:space="preserve">  </w:t>
-      </w:r>
-      <w:hyperlink r:id="rId40">
-        <w:r>
-          <w:rPr>
-            <w:color w:val="0066CC"/>
-            <w:u w:val="single"/>
-          </w:rPr>
-          <w:t>Y Combinator Startup Library</w:t>
-        </w:r>
-      </w:hyperlink>
-      <w:r>
-        <w:t xml:space="preserve"> — Essential startup guides on launching, MVP scoping, and customer acquisition.</w:t>
-      </w:r>
-    </w:p>
-    <w:p>
-      <w:pPr>
-        <w:pStyle w:val="ListBullet"/>
-      </w:pPr>
-      <w:r>
-        <w:t xml:space="preserve">  </w:t>
-      </w:r>
-      <w:hyperlink r:id="rId41">
-        <w:r>
-          <w:rPr>
-            <w:color w:val="0066CC"/>
-            <w:u w:val="single"/>
-          </w:rPr>
-          <w:t>The Mom Test Book Summary</w:t>
-        </w:r>
-      </w:hyperlink>
-      <w:r>
-        <w:t xml:space="preserve"> — How to talk to customers and gather unbiased feedback.</w:t>
-      </w:r>
-    </w:p>
-    <w:p>
-      <w:pPr>
-        <w:pStyle w:val="ListBullet"/>
-      </w:pPr>
-      <w:r>
-        <w:t xml:space="preserve">  </w:t>
-      </w:r>
-      <w:hyperlink r:id="rId42">
-        <w:r>
-          <w:rPr>
-            <w:color w:val="0066CC"/>
-            <w:u w:val="single"/>
-          </w:rPr>
-          <w:t>Continuous Integration &amp; Deployment (CI/CD) Overview</w:t>
-        </w:r>
-      </w:hyperlink>
-      <w:r>
-        <w:t xml:space="preserve"> — Clean introduction to automation pipelines.</w:t>
-      </w:r>
-    </w:p>
-    <w:p>
-      <w:pPr>
-        <w:pStyle w:val="Heading3"/>
-      </w:pPr>
-      <w:r>
-        <w:t>Video Tutorials</w:t>
-      </w:r>
-    </w:p>
-    <w:p>
-      <w:pPr>
-        <w:pStyle w:val="ListBullet"/>
-      </w:pPr>
-      <w:r>
-        <w:t xml:space="preserve">  </w:t>
-      </w:r>
-      <w:hyperlink r:id="rId43">
-        <w:r>
-          <w:rPr>
-            <w:color w:val="0066CC"/>
-            <w:u w:val="single"/>
-          </w:rPr>
-          <w:t>Y Combinator: How to Build an MVP</w:t>
-        </w:r>
-      </w:hyperlink>
-      <w:r>
-        <w:t xml:space="preserve"> — High-level planning video on launching quickly.</w:t>
-      </w:r>
-    </w:p>
-    <w:p>
-      <w:pPr>
-        <w:pStyle w:val="ListBullet"/>
-      </w:pPr>
-      <w:r>
-        <w:t xml:space="preserve">  </w:t>
-      </w:r>
-      <w:hyperlink r:id="rId44">
-        <w:r>
-          <w:rPr>
-            <w:color w:val="0066CC"/>
-            <w:u w:val="single"/>
-          </w:rPr>
-          <w:t>How to Talk to Users (Y Combinator Startup School)</w:t>
-        </w:r>
-      </w:hyperlink>
-      <w:r>
-        <w:t xml:space="preserve"> — Interactive tutorial on interviewing users effectively.</w:t>
-      </w:r>
-    </w:p>
-    <w:p>
-      <w:pPr>
-        <w:pStyle w:val="ListBullet"/>
-      </w:pPr>
-      <w:r>
-        <w:t xml:space="preserve">  </w:t>
-      </w:r>
-      <w:hyperlink r:id="rId45">
-        <w:r>
-          <w:rPr>
-            <w:color w:val="0066CC"/>
-            <w:u w:val="single"/>
-          </w:rPr>
-          <w:t>Software QA Testing Tutorial for Beginners</w:t>
-        </w:r>
-      </w:hyperlink>
-      <w:r>
-        <w:t xml:space="preserve"> — Basic principles of manual testing and bug tracking.</w:t>
-      </w:r>
-    </w:p>
-    <w:p>
-      <w:r>
-        <w:br w:type="page"/>
-      </w:r>
-    </w:p>
-    <w:p>
-      <w:pPr>
-        <w:pStyle w:val="Heading2"/>
-      </w:pPr>
-      <w:r>
-        <w:lastRenderedPageBreak/>
-        <w:t>Module 8 — Career &amp; Freelancing</w:t>
-      </w:r>
-    </w:p>
-    <w:p>
-      <w:pPr>
-        <w:pStyle w:val="ListBullet"/>
-      </w:pPr>
-      <w:r>
-        <w:t>*</w:t>
-      </w:r>
-      <w:proofErr w:type="gramStart"/>
-      <w:r>
-        <w:t>Outcome:*</w:t>
-      </w:r>
-      <w:proofErr w:type="gramEnd"/>
-      <w:r>
-        <w:t>* Leave with opportunities, not just skills.</w:t>
-      </w:r>
-    </w:p>
-    <w:p>
-      <w:pPr>
-        <w:pStyle w:val="Heading3"/>
-      </w:pPr>
-      <w:r>
-        <w:t>Core Concepts &amp; Skills</w:t>
-      </w:r>
-    </w:p>
-    <w:p>
-      <w:pPr>
-        <w:pStyle w:val="ListBullet"/>
-      </w:pPr>
-      <w:r>
-        <w:t xml:space="preserve">  </w:t>
-      </w:r>
-      <w:r>
-        <w:rPr>
-          <w:b/>
-        </w:rPr>
-        <w:t>Portfolio:</w:t>
-      </w:r>
-      <w:r>
-        <w:t xml:space="preserve"> Curated highlights, write-ups (problem, approach, stack, outcome), live demos.</w:t>
-      </w:r>
-    </w:p>
-    <w:p>
-      <w:pPr>
-        <w:pStyle w:val="ListBullet"/>
-      </w:pPr>
-      <w:r>
-        <w:t xml:space="preserve">  </w:t>
-      </w:r>
-      <w:r>
-        <w:rPr>
-          <w:b/>
-        </w:rPr>
-        <w:t>LinkedIn Branding:</w:t>
-      </w:r>
-      <w:r>
-        <w:t xml:space="preserve"> Professional headshots, keyword headlines, featured section pins, work sharing.</w:t>
-      </w:r>
-    </w:p>
-    <w:p>
-      <w:pPr>
-        <w:pStyle w:val="ListBullet"/>
-      </w:pPr>
-      <w:r>
-        <w:t xml:space="preserve">  </w:t>
-      </w:r>
-      <w:r>
-        <w:rPr>
-          <w:b/>
-        </w:rPr>
-        <w:t>Freelancing:</w:t>
-      </w:r>
-      <w:r>
-        <w:t xml:space="preserve"> Platforms (Upwork, Fiverr), rate setting, contract scope, invoice collection.</w:t>
-      </w:r>
-    </w:p>
-    <w:p>
-      <w:pPr>
-        <w:pStyle w:val="ListBullet"/>
-      </w:pPr>
-      <w:r>
-        <w:t xml:space="preserve">  </w:t>
-      </w:r>
-      <w:r>
-        <w:rPr>
-          <w:b/>
-        </w:rPr>
-        <w:t>Client Acquisition:</w:t>
-      </w:r>
-      <w:r>
-        <w:t xml:space="preserve"> Tailored cold outreach, project pitches, expectations alignment.</w:t>
-      </w:r>
-    </w:p>
-    <w:p>
-      <w:pPr>
-        <w:pStyle w:val="ListBullet"/>
-      </w:pPr>
-      <w:r>
-        <w:t xml:space="preserve">  </w:t>
-      </w:r>
-      <w:r>
-        <w:rPr>
-          <w:b/>
-        </w:rPr>
-        <w:t>Interview Prep:</w:t>
-      </w:r>
-      <w:r>
-        <w:t xml:space="preserve"> Behavioral walkthroughs, technical coding challenges, system designs explanations.</w:t>
-      </w:r>
-    </w:p>
-    <w:p>
-      <w:pPr>
-        <w:pStyle w:val="Heading3"/>
-      </w:pPr>
-      <w:r>
-        <w:t>Curated Online Resources &amp; Documentation</w:t>
-      </w:r>
-    </w:p>
-    <w:p>
-      <w:pPr>
-        <w:pStyle w:val="ListBullet"/>
-      </w:pPr>
-      <w:r>
-        <w:t xml:space="preserve">  </w:t>
-      </w:r>
-      <w:hyperlink r:id="rId46">
-        <w:r>
-          <w:rPr>
-            <w:color w:val="0066CC"/>
-            <w:u w:val="single"/>
-          </w:rPr>
-          <w:t>Awesome GitHub Profile README List</w:t>
-        </w:r>
-      </w:hyperlink>
-      <w:r>
-        <w:t xml:space="preserve"> — Gallery of standout GitHub profile README templates.</w:t>
-      </w:r>
-    </w:p>
-    <w:p>
-      <w:pPr>
-        <w:pStyle w:val="ListBullet"/>
-      </w:pPr>
-      <w:r>
-        <w:t xml:space="preserve">  </w:t>
-      </w:r>
-      <w:hyperlink r:id="rId47">
-        <w:r>
-          <w:rPr>
-            <w:color w:val="0066CC"/>
-            <w:u w:val="single"/>
-          </w:rPr>
-          <w:t>Upwork Resource Center: Freelancer Guide</w:t>
-        </w:r>
-      </w:hyperlink>
-      <w:r>
-        <w:t xml:space="preserve"> — Official guidelines on building Upwork profiles.</w:t>
-      </w:r>
-    </w:p>
-    <w:p>
-      <w:pPr>
-        <w:pStyle w:val="ListBullet"/>
-      </w:pPr>
-      <w:r>
-        <w:t xml:space="preserve">  </w:t>
-      </w:r>
-      <w:hyperlink r:id="rId48">
-        <w:r>
-          <w:rPr>
-            <w:color w:val="0066CC"/>
-            <w:u w:val="single"/>
-          </w:rPr>
-          <w:t>Tech Interview Handbook</w:t>
-        </w:r>
-      </w:hyperlink>
-      <w:r>
-        <w:t xml:space="preserve"> — Complete handbook for coding interviews, CV writing, and system design.</w:t>
-      </w:r>
-    </w:p>
-    <w:p>
-      <w:pPr>
-        <w:pStyle w:val="Heading3"/>
-      </w:pPr>
-      <w:r>
-        <w:t>Video Tutorials</w:t>
-      </w:r>
-    </w:p>
-    <w:p>
-      <w:pPr>
-        <w:pStyle w:val="ListBullet"/>
-      </w:pPr>
-      <w:r>
-        <w:t xml:space="preserve">  </w:t>
-      </w:r>
-      <w:hyperlink r:id="rId49">
-        <w:r>
-          <w:rPr>
-            <w:color w:val="0066CC"/>
-            <w:u w:val="single"/>
-          </w:rPr>
-          <w:t>LinkedIn Profile Optimization for Software Engineers</w:t>
-        </w:r>
-      </w:hyperlink>
-      <w:r>
-        <w:t xml:space="preserve"> — Video showing how to position your profile for recruiters.</w:t>
-      </w:r>
-    </w:p>
-    <w:p>
-      <w:pPr>
-        <w:pStyle w:val="ListBullet"/>
-      </w:pPr>
-      <w:r>
-        <w:t xml:space="preserve">  </w:t>
-      </w:r>
-      <w:hyperlink r:id="rId50">
-        <w:r>
-          <w:rPr>
-            <w:color w:val="0066CC"/>
-            <w:u w:val="single"/>
-          </w:rPr>
-          <w:t>How to Get Your First Client on Upwork</w:t>
-        </w:r>
-      </w:hyperlink>
-      <w:r>
-        <w:t xml:space="preserve"> — Detailed bidding strategy for starting on freelance platforms.</w:t>
-      </w:r>
-    </w:p>
-    <w:p>
-      <w:pPr>
-        <w:pStyle w:val="ListBullet"/>
-      </w:pPr>
-      <w:r>
-        <w:t xml:space="preserve">  </w:t>
-      </w:r>
-      <w:hyperlink r:id="rId51">
-        <w:r>
-          <w:rPr>
-            <w:color w:val="0066CC"/>
-            <w:u w:val="single"/>
-          </w:rPr>
-          <w:t>Software Engineer Portfolio Walkthrough &amp; Tips</w:t>
-        </w:r>
-      </w:hyperlink>
-      <w:r>
-        <w:t xml:space="preserve"> — Learn what recruiters and clients look for in project write-ups.</w:t>
-      </w:r>
-    </w:p>
+    <w:p/>
     <w:sectPr>
       <w:pgSz w:w="12240" w:h="15840"/>
       <w:pgMar w:top="1440" w:right="1440" w:bottom="1440" w:left="1440" w:header="720" w:footer="720" w:gutter="0"/>
@@ -2281,7 +168,7 @@
   <w:abstractNum w:abstractNumId="8" w15:restartNumberingAfterBreak="0">
     <w:nsid w:val="FFFFFF89"/>
     <w:multiLevelType w:val="singleLevel"/>
-    <w:tmpl w:val="2C0ACD80"/>
+    <w:tmpl w:val="C840E410"/>
     <w:lvl w:ilvl="0">
       <w:start w:val="1"/>
       <w:numFmt w:val="bullet"/>

</xml_diff>